<commit_message>
Number the administrator simulator scenario table rows.
Co-authored-by: lysakalenushka-hash <lysakalenushka-hash@users.noreply.github.com>
</commit_message>
<xml_diff>
--- a/issledovaniya/vizualy/scenariy-simulyator-administratora.docx
+++ b/issledovaniya/vizualy/scenariy-simulyator-administratora.docx
@@ -46,14 +46,33 @@
         <w:tblLook w:firstColumn="1" w:firstRow="1" w:lastColumn="0" w:lastRow="0" w:noHBand="0" w:noVBand="1" w:val="04A0"/>
       </w:tblPr>
       <w:tblGrid>
-        <w:gridCol w:w="3400"/>
-        <w:gridCol w:w="3400"/>
-        <w:gridCol w:w="3400"/>
+        <w:gridCol w:w="2550"/>
+        <w:gridCol w:w="2550"/>
+        <w:gridCol w:w="2550"/>
+        <w:gridCol w:w="2550"/>
       </w:tblGrid>
       <w:tr>
         <w:tc>
           <w:tcPr>
-            <w:tcW w:type="dxa" w:w="3061"/>
+            <w:tcW w:type="dxa" w:w="680"/>
+            <w:shd w:fill="0B1F3A" w:val="clear"/>
+          </w:tcPr>
+          <w:p>
+            <w:r/>
+            <w:r>
+              <w:rPr>
+                <w:rFonts w:ascii="Calibri" w:hAnsi="Calibri" w:eastAsia="Calibri"/>
+                <w:b/>
+                <w:color w:val="FFFFFF"/>
+                <w:sz w:val="22"/>
+              </w:rPr>
+              <w:t>№</w:t>
+            </w:r>
+          </w:p>
+        </w:tc>
+        <w:tc>
+          <w:tcPr>
+            <w:tcW w:type="dxa" w:w="2948"/>
             <w:shd w:fill="0B1F3A" w:val="clear"/>
           </w:tcPr>
           <w:p>
@@ -71,7 +90,7 @@
         </w:tc>
         <w:tc>
           <w:tcPr>
-            <w:tcW w:type="dxa" w:w="3515"/>
+            <w:tcW w:type="dxa" w:w="3288"/>
             <w:shd w:fill="0B1F3A" w:val="clear"/>
           </w:tcPr>
           <w:p>
@@ -89,7 +108,7 @@
         </w:tc>
         <w:tc>
           <w:tcPr>
-            <w:tcW w:type="dxa" w:w="3742"/>
+            <w:tcW w:type="dxa" w:w="3402"/>
             <w:shd w:fill="0B1F3A" w:val="clear"/>
           </w:tcPr>
           <w:p>
@@ -109,7 +128,25 @@
       <w:tr>
         <w:tc>
           <w:tcPr>
-            <w:tcW w:type="dxa" w:w="3061"/>
+            <w:tcW w:type="dxa" w:w="680"/>
+            <w:shd w:fill="F4F6F9" w:val="clear"/>
+          </w:tcPr>
+          <w:p>
+            <w:r/>
+            <w:r>
+              <w:rPr>
+                <w:rFonts w:ascii="Calibri" w:hAnsi="Calibri" w:eastAsia="Calibri"/>
+                <w:b/>
+                <w:color w:val="1A2332"/>
+                <w:sz w:val="22"/>
+              </w:rPr>
+              <w:t>1</w:t>
+            </w:r>
+          </w:p>
+        </w:tc>
+        <w:tc>
+          <w:tcPr>
+            <w:tcW w:type="dxa" w:w="2948"/>
             <w:shd w:fill="F4F6F9" w:val="clear"/>
           </w:tcPr>
           <w:p>
@@ -127,7 +164,7 @@
         </w:tc>
         <w:tc>
           <w:tcPr>
-            <w:tcW w:type="dxa" w:w="3515"/>
+            <w:tcW w:type="dxa" w:w="3288"/>
             <w:shd w:fill="F4F6F9" w:val="clear"/>
           </w:tcPr>
           <w:p>
@@ -145,7 +182,7 @@
         </w:tc>
         <w:tc>
           <w:tcPr>
-            <w:tcW w:type="dxa" w:w="3742"/>
+            <w:tcW w:type="dxa" w:w="3402"/>
             <w:shd w:fill="F4F6F9" w:val="clear"/>
           </w:tcPr>
           <w:p>
@@ -165,7 +202,25 @@
       <w:tr>
         <w:tc>
           <w:tcPr>
-            <w:tcW w:type="dxa" w:w="3061"/>
+            <w:tcW w:type="dxa" w:w="680"/>
+            <w:shd w:fill="FFFFFF" w:val="clear"/>
+          </w:tcPr>
+          <w:p>
+            <w:r/>
+            <w:r>
+              <w:rPr>
+                <w:rFonts w:ascii="Calibri" w:hAnsi="Calibri" w:eastAsia="Calibri"/>
+                <w:b/>
+                <w:color w:val="1A2332"/>
+                <w:sz w:val="22"/>
+              </w:rPr>
+              <w:t>2</w:t>
+            </w:r>
+          </w:p>
+        </w:tc>
+        <w:tc>
+          <w:tcPr>
+            <w:tcW w:type="dxa" w:w="2948"/>
             <w:shd w:fill="FFFFFF" w:val="clear"/>
           </w:tcPr>
           <w:p>
@@ -183,7 +238,7 @@
         </w:tc>
         <w:tc>
           <w:tcPr>
-            <w:tcW w:type="dxa" w:w="3515"/>
+            <w:tcW w:type="dxa" w:w="3288"/>
             <w:shd w:fill="FFFFFF" w:val="clear"/>
           </w:tcPr>
           <w:p>
@@ -201,7 +256,7 @@
         </w:tc>
         <w:tc>
           <w:tcPr>
-            <w:tcW w:type="dxa" w:w="3742"/>
+            <w:tcW w:type="dxa" w:w="3402"/>
             <w:shd w:fill="FFFFFF" w:val="clear"/>
           </w:tcPr>
           <w:p>
@@ -221,7 +276,25 @@
       <w:tr>
         <w:tc>
           <w:tcPr>
-            <w:tcW w:type="dxa" w:w="3061"/>
+            <w:tcW w:type="dxa" w:w="680"/>
+            <w:shd w:fill="F4F6F9" w:val="clear"/>
+          </w:tcPr>
+          <w:p>
+            <w:r/>
+            <w:r>
+              <w:rPr>
+                <w:rFonts w:ascii="Calibri" w:hAnsi="Calibri" w:eastAsia="Calibri"/>
+                <w:b/>
+                <w:color w:val="1A2332"/>
+                <w:sz w:val="22"/>
+              </w:rPr>
+              <w:t>3</w:t>
+            </w:r>
+          </w:p>
+        </w:tc>
+        <w:tc>
+          <w:tcPr>
+            <w:tcW w:type="dxa" w:w="2948"/>
             <w:shd w:fill="F4F6F9" w:val="clear"/>
           </w:tcPr>
           <w:p>
@@ -239,7 +312,7 @@
         </w:tc>
         <w:tc>
           <w:tcPr>
-            <w:tcW w:type="dxa" w:w="3515"/>
+            <w:tcW w:type="dxa" w:w="3288"/>
             <w:shd w:fill="F4F6F9" w:val="clear"/>
           </w:tcPr>
           <w:p>
@@ -257,7 +330,7 @@
         </w:tc>
         <w:tc>
           <w:tcPr>
-            <w:tcW w:type="dxa" w:w="3742"/>
+            <w:tcW w:type="dxa" w:w="3402"/>
             <w:shd w:fill="F4F6F9" w:val="clear"/>
           </w:tcPr>
           <w:p>
@@ -277,7 +350,25 @@
       <w:tr>
         <w:tc>
           <w:tcPr>
-            <w:tcW w:type="dxa" w:w="3061"/>
+            <w:tcW w:type="dxa" w:w="680"/>
+            <w:shd w:fill="FFFFFF" w:val="clear"/>
+          </w:tcPr>
+          <w:p>
+            <w:r/>
+            <w:r>
+              <w:rPr>
+                <w:rFonts w:ascii="Calibri" w:hAnsi="Calibri" w:eastAsia="Calibri"/>
+                <w:b/>
+                <w:color w:val="1A2332"/>
+                <w:sz w:val="22"/>
+              </w:rPr>
+              <w:t>4</w:t>
+            </w:r>
+          </w:p>
+        </w:tc>
+        <w:tc>
+          <w:tcPr>
+            <w:tcW w:type="dxa" w:w="2948"/>
             <w:shd w:fill="FFFFFF" w:val="clear"/>
           </w:tcPr>
           <w:p>
@@ -295,7 +386,7 @@
         </w:tc>
         <w:tc>
           <w:tcPr>
-            <w:tcW w:type="dxa" w:w="3515"/>
+            <w:tcW w:type="dxa" w:w="3288"/>
             <w:shd w:fill="FFFFFF" w:val="clear"/>
           </w:tcPr>
           <w:p>
@@ -313,7 +404,7 @@
         </w:tc>
         <w:tc>
           <w:tcPr>
-            <w:tcW w:type="dxa" w:w="3742"/>
+            <w:tcW w:type="dxa" w:w="3402"/>
             <w:shd w:fill="FFFFFF" w:val="clear"/>
           </w:tcPr>
           <w:p>
@@ -333,7 +424,25 @@
       <w:tr>
         <w:tc>
           <w:tcPr>
-            <w:tcW w:type="dxa" w:w="3061"/>
+            <w:tcW w:type="dxa" w:w="680"/>
+            <w:shd w:fill="F4F6F9" w:val="clear"/>
+          </w:tcPr>
+          <w:p>
+            <w:r/>
+            <w:r>
+              <w:rPr>
+                <w:rFonts w:ascii="Calibri" w:hAnsi="Calibri" w:eastAsia="Calibri"/>
+                <w:b/>
+                <w:color w:val="1A2332"/>
+                <w:sz w:val="22"/>
+              </w:rPr>
+              <w:t>5</w:t>
+            </w:r>
+          </w:p>
+        </w:tc>
+        <w:tc>
+          <w:tcPr>
+            <w:tcW w:type="dxa" w:w="2948"/>
             <w:shd w:fill="F4F6F9" w:val="clear"/>
           </w:tcPr>
           <w:p>
@@ -351,7 +460,7 @@
         </w:tc>
         <w:tc>
           <w:tcPr>
-            <w:tcW w:type="dxa" w:w="3515"/>
+            <w:tcW w:type="dxa" w:w="3288"/>
             <w:shd w:fill="F4F6F9" w:val="clear"/>
           </w:tcPr>
           <w:p>
@@ -369,7 +478,7 @@
         </w:tc>
         <w:tc>
           <w:tcPr>
-            <w:tcW w:type="dxa" w:w="3742"/>
+            <w:tcW w:type="dxa" w:w="3402"/>
             <w:shd w:fill="F4F6F9" w:val="clear"/>
           </w:tcPr>
           <w:p>
@@ -389,7 +498,25 @@
       <w:tr>
         <w:tc>
           <w:tcPr>
-            <w:tcW w:type="dxa" w:w="3061"/>
+            <w:tcW w:type="dxa" w:w="680"/>
+            <w:shd w:fill="FFFFFF" w:val="clear"/>
+          </w:tcPr>
+          <w:p>
+            <w:r/>
+            <w:r>
+              <w:rPr>
+                <w:rFonts w:ascii="Calibri" w:hAnsi="Calibri" w:eastAsia="Calibri"/>
+                <w:b/>
+                <w:color w:val="1A2332"/>
+                <w:sz w:val="22"/>
+              </w:rPr>
+              <w:t>6</w:t>
+            </w:r>
+          </w:p>
+        </w:tc>
+        <w:tc>
+          <w:tcPr>
+            <w:tcW w:type="dxa" w:w="2948"/>
             <w:shd w:fill="FFFFFF" w:val="clear"/>
           </w:tcPr>
           <w:p>
@@ -407,7 +534,7 @@
         </w:tc>
         <w:tc>
           <w:tcPr>
-            <w:tcW w:type="dxa" w:w="3515"/>
+            <w:tcW w:type="dxa" w:w="3288"/>
             <w:shd w:fill="FFFFFF" w:val="clear"/>
           </w:tcPr>
           <w:p>
@@ -425,7 +552,7 @@
         </w:tc>
         <w:tc>
           <w:tcPr>
-            <w:tcW w:type="dxa" w:w="3742"/>
+            <w:tcW w:type="dxa" w:w="3402"/>
             <w:shd w:fill="FFFFFF" w:val="clear"/>
           </w:tcPr>
           <w:p>
@@ -445,7 +572,25 @@
       <w:tr>
         <w:tc>
           <w:tcPr>
-            <w:tcW w:type="dxa" w:w="3061"/>
+            <w:tcW w:type="dxa" w:w="680"/>
+            <w:shd w:fill="F4F6F9" w:val="clear"/>
+          </w:tcPr>
+          <w:p>
+            <w:r/>
+            <w:r>
+              <w:rPr>
+                <w:rFonts w:ascii="Calibri" w:hAnsi="Calibri" w:eastAsia="Calibri"/>
+                <w:b/>
+                <w:color w:val="1A2332"/>
+                <w:sz w:val="22"/>
+              </w:rPr>
+              <w:t>7</w:t>
+            </w:r>
+          </w:p>
+        </w:tc>
+        <w:tc>
+          <w:tcPr>
+            <w:tcW w:type="dxa" w:w="2948"/>
             <w:shd w:fill="F4F6F9" w:val="clear"/>
           </w:tcPr>
           <w:p>
@@ -463,7 +608,7 @@
         </w:tc>
         <w:tc>
           <w:tcPr>
-            <w:tcW w:type="dxa" w:w="3515"/>
+            <w:tcW w:type="dxa" w:w="3288"/>
             <w:shd w:fill="F4F6F9" w:val="clear"/>
           </w:tcPr>
           <w:p>
@@ -481,7 +626,7 @@
         </w:tc>
         <w:tc>
           <w:tcPr>
-            <w:tcW w:type="dxa" w:w="3742"/>
+            <w:tcW w:type="dxa" w:w="3402"/>
             <w:shd w:fill="F4F6F9" w:val="clear"/>
           </w:tcPr>
           <w:p>
@@ -501,7 +646,25 @@
       <w:tr>
         <w:tc>
           <w:tcPr>
-            <w:tcW w:type="dxa" w:w="3061"/>
+            <w:tcW w:type="dxa" w:w="680"/>
+            <w:shd w:fill="FFFFFF" w:val="clear"/>
+          </w:tcPr>
+          <w:p>
+            <w:r/>
+            <w:r>
+              <w:rPr>
+                <w:rFonts w:ascii="Calibri" w:hAnsi="Calibri" w:eastAsia="Calibri"/>
+                <w:b/>
+                <w:color w:val="1A2332"/>
+                <w:sz w:val="22"/>
+              </w:rPr>
+              <w:t>8</w:t>
+            </w:r>
+          </w:p>
+        </w:tc>
+        <w:tc>
+          <w:tcPr>
+            <w:tcW w:type="dxa" w:w="2948"/>
             <w:shd w:fill="FFFFFF" w:val="clear"/>
           </w:tcPr>
           <w:p>
@@ -519,7 +682,7 @@
         </w:tc>
         <w:tc>
           <w:tcPr>
-            <w:tcW w:type="dxa" w:w="3515"/>
+            <w:tcW w:type="dxa" w:w="3288"/>
             <w:shd w:fill="FFFFFF" w:val="clear"/>
           </w:tcPr>
           <w:p>
@@ -537,7 +700,7 @@
         </w:tc>
         <w:tc>
           <w:tcPr>
-            <w:tcW w:type="dxa" w:w="3742"/>
+            <w:tcW w:type="dxa" w:w="3402"/>
             <w:shd w:fill="FFFFFF" w:val="clear"/>
           </w:tcPr>
           <w:p>
@@ -557,7 +720,25 @@
       <w:tr>
         <w:tc>
           <w:tcPr>
-            <w:tcW w:type="dxa" w:w="3061"/>
+            <w:tcW w:type="dxa" w:w="680"/>
+            <w:shd w:fill="F4F6F9" w:val="clear"/>
+          </w:tcPr>
+          <w:p>
+            <w:r/>
+            <w:r>
+              <w:rPr>
+                <w:rFonts w:ascii="Calibri" w:hAnsi="Calibri" w:eastAsia="Calibri"/>
+                <w:b/>
+                <w:color w:val="1A2332"/>
+                <w:sz w:val="22"/>
+              </w:rPr>
+              <w:t>9</w:t>
+            </w:r>
+          </w:p>
+        </w:tc>
+        <w:tc>
+          <w:tcPr>
+            <w:tcW w:type="dxa" w:w="2948"/>
             <w:shd w:fill="F4F6F9" w:val="clear"/>
           </w:tcPr>
           <w:p>
@@ -575,7 +756,7 @@
         </w:tc>
         <w:tc>
           <w:tcPr>
-            <w:tcW w:type="dxa" w:w="3515"/>
+            <w:tcW w:type="dxa" w:w="3288"/>
             <w:shd w:fill="F4F6F9" w:val="clear"/>
           </w:tcPr>
           <w:p>
@@ -593,7 +774,7 @@
         </w:tc>
         <w:tc>
           <w:tcPr>
-            <w:tcW w:type="dxa" w:w="3742"/>
+            <w:tcW w:type="dxa" w:w="3402"/>
             <w:shd w:fill="F4F6F9" w:val="clear"/>
           </w:tcPr>
           <w:p>
@@ -613,7 +794,25 @@
       <w:tr>
         <w:tc>
           <w:tcPr>
-            <w:tcW w:type="dxa" w:w="3061"/>
+            <w:tcW w:type="dxa" w:w="680"/>
+            <w:shd w:fill="FFFFFF" w:val="clear"/>
+          </w:tcPr>
+          <w:p>
+            <w:r/>
+            <w:r>
+              <w:rPr>
+                <w:rFonts w:ascii="Calibri" w:hAnsi="Calibri" w:eastAsia="Calibri"/>
+                <w:b/>
+                <w:color w:val="1A2332"/>
+                <w:sz w:val="22"/>
+              </w:rPr>
+              <w:t>10</w:t>
+            </w:r>
+          </w:p>
+        </w:tc>
+        <w:tc>
+          <w:tcPr>
+            <w:tcW w:type="dxa" w:w="2948"/>
             <w:shd w:fill="FFFFFF" w:val="clear"/>
           </w:tcPr>
           <w:p>
@@ -631,7 +830,7 @@
         </w:tc>
         <w:tc>
           <w:tcPr>
-            <w:tcW w:type="dxa" w:w="3515"/>
+            <w:tcW w:type="dxa" w:w="3288"/>
             <w:shd w:fill="FFFFFF" w:val="clear"/>
           </w:tcPr>
           <w:p>
@@ -649,7 +848,7 @@
         </w:tc>
         <w:tc>
           <w:tcPr>
-            <w:tcW w:type="dxa" w:w="3742"/>
+            <w:tcW w:type="dxa" w:w="3402"/>
             <w:shd w:fill="FFFFFF" w:val="clear"/>
           </w:tcPr>
           <w:p>
@@ -669,7 +868,25 @@
       <w:tr>
         <w:tc>
           <w:tcPr>
-            <w:tcW w:type="dxa" w:w="3061"/>
+            <w:tcW w:type="dxa" w:w="680"/>
+            <w:shd w:fill="F4F6F9" w:val="clear"/>
+          </w:tcPr>
+          <w:p>
+            <w:r/>
+            <w:r>
+              <w:rPr>
+                <w:rFonts w:ascii="Calibri" w:hAnsi="Calibri" w:eastAsia="Calibri"/>
+                <w:b/>
+                <w:color w:val="1A2332"/>
+                <w:sz w:val="22"/>
+              </w:rPr>
+              <w:t>11</w:t>
+            </w:r>
+          </w:p>
+        </w:tc>
+        <w:tc>
+          <w:tcPr>
+            <w:tcW w:type="dxa" w:w="2948"/>
             <w:shd w:fill="F4F6F9" w:val="clear"/>
           </w:tcPr>
           <w:p>
@@ -687,7 +904,7 @@
         </w:tc>
         <w:tc>
           <w:tcPr>
-            <w:tcW w:type="dxa" w:w="3515"/>
+            <w:tcW w:type="dxa" w:w="3288"/>
             <w:shd w:fill="F4F6F9" w:val="clear"/>
           </w:tcPr>
           <w:p>
@@ -705,7 +922,7 @@
         </w:tc>
         <w:tc>
           <w:tcPr>
-            <w:tcW w:type="dxa" w:w="3742"/>
+            <w:tcW w:type="dxa" w:w="3402"/>
             <w:shd w:fill="F4F6F9" w:val="clear"/>
           </w:tcPr>
           <w:p>
@@ -725,7 +942,25 @@
       <w:tr>
         <w:tc>
           <w:tcPr>
-            <w:tcW w:type="dxa" w:w="3061"/>
+            <w:tcW w:type="dxa" w:w="680"/>
+            <w:shd w:fill="FFFFFF" w:val="clear"/>
+          </w:tcPr>
+          <w:p>
+            <w:r/>
+            <w:r>
+              <w:rPr>
+                <w:rFonts w:ascii="Calibri" w:hAnsi="Calibri" w:eastAsia="Calibri"/>
+                <w:b/>
+                <w:color w:val="1A2332"/>
+                <w:sz w:val="22"/>
+              </w:rPr>
+              <w:t>12</w:t>
+            </w:r>
+          </w:p>
+        </w:tc>
+        <w:tc>
+          <w:tcPr>
+            <w:tcW w:type="dxa" w:w="2948"/>
             <w:shd w:fill="FFFFFF" w:val="clear"/>
           </w:tcPr>
           <w:p>
@@ -743,7 +978,7 @@
         </w:tc>
         <w:tc>
           <w:tcPr>
-            <w:tcW w:type="dxa" w:w="3515"/>
+            <w:tcW w:type="dxa" w:w="3288"/>
             <w:shd w:fill="FFFFFF" w:val="clear"/>
           </w:tcPr>
           <w:p>
@@ -761,7 +996,7 @@
         </w:tc>
         <w:tc>
           <w:tcPr>
-            <w:tcW w:type="dxa" w:w="3742"/>
+            <w:tcW w:type="dxa" w:w="3402"/>
             <w:shd w:fill="FFFFFF" w:val="clear"/>
           </w:tcPr>
           <w:p>
@@ -781,7 +1016,25 @@
       <w:tr>
         <w:tc>
           <w:tcPr>
-            <w:tcW w:type="dxa" w:w="3061"/>
+            <w:tcW w:type="dxa" w:w="680"/>
+            <w:shd w:fill="F4F6F9" w:val="clear"/>
+          </w:tcPr>
+          <w:p>
+            <w:r/>
+            <w:r>
+              <w:rPr>
+                <w:rFonts w:ascii="Calibri" w:hAnsi="Calibri" w:eastAsia="Calibri"/>
+                <w:b/>
+                <w:color w:val="1A2332"/>
+                <w:sz w:val="22"/>
+              </w:rPr>
+              <w:t>13</w:t>
+            </w:r>
+          </w:p>
+        </w:tc>
+        <w:tc>
+          <w:tcPr>
+            <w:tcW w:type="dxa" w:w="2948"/>
             <w:shd w:fill="F4F6F9" w:val="clear"/>
           </w:tcPr>
           <w:p>
@@ -799,7 +1052,7 @@
         </w:tc>
         <w:tc>
           <w:tcPr>
-            <w:tcW w:type="dxa" w:w="3515"/>
+            <w:tcW w:type="dxa" w:w="3288"/>
             <w:shd w:fill="F4F6F9" w:val="clear"/>
           </w:tcPr>
           <w:p>
@@ -817,7 +1070,7 @@
         </w:tc>
         <w:tc>
           <w:tcPr>
-            <w:tcW w:type="dxa" w:w="3742"/>
+            <w:tcW w:type="dxa" w:w="3402"/>
             <w:shd w:fill="F4F6F9" w:val="clear"/>
           </w:tcPr>
           <w:p>
@@ -837,7 +1090,25 @@
       <w:tr>
         <w:tc>
           <w:tcPr>
-            <w:tcW w:type="dxa" w:w="3061"/>
+            <w:tcW w:type="dxa" w:w="680"/>
+            <w:shd w:fill="FFFFFF" w:val="clear"/>
+          </w:tcPr>
+          <w:p>
+            <w:r/>
+            <w:r>
+              <w:rPr>
+                <w:rFonts w:ascii="Calibri" w:hAnsi="Calibri" w:eastAsia="Calibri"/>
+                <w:b/>
+                <w:color w:val="1A2332"/>
+                <w:sz w:val="22"/>
+              </w:rPr>
+              <w:t>14</w:t>
+            </w:r>
+          </w:p>
+        </w:tc>
+        <w:tc>
+          <w:tcPr>
+            <w:tcW w:type="dxa" w:w="2948"/>
             <w:shd w:fill="FFFFFF" w:val="clear"/>
           </w:tcPr>
           <w:p>
@@ -855,7 +1126,7 @@
         </w:tc>
         <w:tc>
           <w:tcPr>
-            <w:tcW w:type="dxa" w:w="3515"/>
+            <w:tcW w:type="dxa" w:w="3288"/>
             <w:shd w:fill="FFFFFF" w:val="clear"/>
           </w:tcPr>
           <w:p>
@@ -873,7 +1144,7 @@
         </w:tc>
         <w:tc>
           <w:tcPr>
-            <w:tcW w:type="dxa" w:w="3742"/>
+            <w:tcW w:type="dxa" w:w="3402"/>
             <w:shd w:fill="FFFFFF" w:val="clear"/>
           </w:tcPr>
           <w:p>
@@ -893,7 +1164,25 @@
       <w:tr>
         <w:tc>
           <w:tcPr>
-            <w:tcW w:type="dxa" w:w="3061"/>
+            <w:tcW w:type="dxa" w:w="680"/>
+            <w:shd w:fill="F4F6F9" w:val="clear"/>
+          </w:tcPr>
+          <w:p>
+            <w:r/>
+            <w:r>
+              <w:rPr>
+                <w:rFonts w:ascii="Calibri" w:hAnsi="Calibri" w:eastAsia="Calibri"/>
+                <w:b/>
+                <w:color w:val="1A2332"/>
+                <w:sz w:val="22"/>
+              </w:rPr>
+              <w:t>15</w:t>
+            </w:r>
+          </w:p>
+        </w:tc>
+        <w:tc>
+          <w:tcPr>
+            <w:tcW w:type="dxa" w:w="2948"/>
             <w:shd w:fill="F4F6F9" w:val="clear"/>
           </w:tcPr>
           <w:p>
@@ -911,7 +1200,7 @@
         </w:tc>
         <w:tc>
           <w:tcPr>
-            <w:tcW w:type="dxa" w:w="3515"/>
+            <w:tcW w:type="dxa" w:w="3288"/>
             <w:shd w:fill="F4F6F9" w:val="clear"/>
           </w:tcPr>
           <w:p>
@@ -929,7 +1218,7 @@
         </w:tc>
         <w:tc>
           <w:tcPr>
-            <w:tcW w:type="dxa" w:w="3742"/>
+            <w:tcW w:type="dxa" w:w="3402"/>
             <w:shd w:fill="F4F6F9" w:val="clear"/>
           </w:tcPr>
           <w:p>
@@ -949,7 +1238,25 @@
       <w:tr>
         <w:tc>
           <w:tcPr>
-            <w:tcW w:type="dxa" w:w="3061"/>
+            <w:tcW w:type="dxa" w:w="680"/>
+            <w:shd w:fill="FFFFFF" w:val="clear"/>
+          </w:tcPr>
+          <w:p>
+            <w:r/>
+            <w:r>
+              <w:rPr>
+                <w:rFonts w:ascii="Calibri" w:hAnsi="Calibri" w:eastAsia="Calibri"/>
+                <w:b/>
+                <w:color w:val="1A2332"/>
+                <w:sz w:val="22"/>
+              </w:rPr>
+              <w:t>16</w:t>
+            </w:r>
+          </w:p>
+        </w:tc>
+        <w:tc>
+          <w:tcPr>
+            <w:tcW w:type="dxa" w:w="2948"/>
             <w:shd w:fill="FFFFFF" w:val="clear"/>
           </w:tcPr>
           <w:p>
@@ -967,7 +1274,7 @@
         </w:tc>
         <w:tc>
           <w:tcPr>
-            <w:tcW w:type="dxa" w:w="3515"/>
+            <w:tcW w:type="dxa" w:w="3288"/>
             <w:shd w:fill="FFFFFF" w:val="clear"/>
           </w:tcPr>
           <w:p>
@@ -985,7 +1292,7 @@
         </w:tc>
         <w:tc>
           <w:tcPr>
-            <w:tcW w:type="dxa" w:w="3742"/>
+            <w:tcW w:type="dxa" w:w="3402"/>
             <w:shd w:fill="FFFFFF" w:val="clear"/>
           </w:tcPr>
           <w:p>
@@ -1005,7 +1312,25 @@
       <w:tr>
         <w:tc>
           <w:tcPr>
-            <w:tcW w:type="dxa" w:w="3061"/>
+            <w:tcW w:type="dxa" w:w="680"/>
+            <w:shd w:fill="F4F6F9" w:val="clear"/>
+          </w:tcPr>
+          <w:p>
+            <w:r/>
+            <w:r>
+              <w:rPr>
+                <w:rFonts w:ascii="Calibri" w:hAnsi="Calibri" w:eastAsia="Calibri"/>
+                <w:b/>
+                <w:color w:val="1A2332"/>
+                <w:sz w:val="22"/>
+              </w:rPr>
+              <w:t>17</w:t>
+            </w:r>
+          </w:p>
+        </w:tc>
+        <w:tc>
+          <w:tcPr>
+            <w:tcW w:type="dxa" w:w="2948"/>
             <w:shd w:fill="F4F6F9" w:val="clear"/>
           </w:tcPr>
           <w:p>
@@ -1023,7 +1348,7 @@
         </w:tc>
         <w:tc>
           <w:tcPr>
-            <w:tcW w:type="dxa" w:w="3515"/>
+            <w:tcW w:type="dxa" w:w="3288"/>
             <w:shd w:fill="F4F6F9" w:val="clear"/>
           </w:tcPr>
           <w:p>
@@ -1041,7 +1366,7 @@
         </w:tc>
         <w:tc>
           <w:tcPr>
-            <w:tcW w:type="dxa" w:w="3742"/>
+            <w:tcW w:type="dxa" w:w="3402"/>
             <w:shd w:fill="F4F6F9" w:val="clear"/>
           </w:tcPr>
           <w:p>
@@ -1061,7 +1386,25 @@
       <w:tr>
         <w:tc>
           <w:tcPr>
-            <w:tcW w:type="dxa" w:w="3061"/>
+            <w:tcW w:type="dxa" w:w="680"/>
+            <w:shd w:fill="FFFFFF" w:val="clear"/>
+          </w:tcPr>
+          <w:p>
+            <w:r/>
+            <w:r>
+              <w:rPr>
+                <w:rFonts w:ascii="Calibri" w:hAnsi="Calibri" w:eastAsia="Calibri"/>
+                <w:b/>
+                <w:color w:val="1A2332"/>
+                <w:sz w:val="22"/>
+              </w:rPr>
+              <w:t>18</w:t>
+            </w:r>
+          </w:p>
+        </w:tc>
+        <w:tc>
+          <w:tcPr>
+            <w:tcW w:type="dxa" w:w="2948"/>
             <w:shd w:fill="FFFFFF" w:val="clear"/>
           </w:tcPr>
           <w:p>
@@ -1079,7 +1422,7 @@
         </w:tc>
         <w:tc>
           <w:tcPr>
-            <w:tcW w:type="dxa" w:w="3515"/>
+            <w:tcW w:type="dxa" w:w="3288"/>
             <w:shd w:fill="FFFFFF" w:val="clear"/>
           </w:tcPr>
           <w:p>
@@ -1097,7 +1440,7 @@
         </w:tc>
         <w:tc>
           <w:tcPr>
-            <w:tcW w:type="dxa" w:w="3742"/>
+            <w:tcW w:type="dxa" w:w="3402"/>
             <w:shd w:fill="FFFFFF" w:val="clear"/>
           </w:tcPr>
           <w:p>
@@ -1117,7 +1460,25 @@
       <w:tr>
         <w:tc>
           <w:tcPr>
-            <w:tcW w:type="dxa" w:w="3061"/>
+            <w:tcW w:type="dxa" w:w="680"/>
+            <w:shd w:fill="F4F6F9" w:val="clear"/>
+          </w:tcPr>
+          <w:p>
+            <w:r/>
+            <w:r>
+              <w:rPr>
+                <w:rFonts w:ascii="Calibri" w:hAnsi="Calibri" w:eastAsia="Calibri"/>
+                <w:b/>
+                <w:color w:val="1A2332"/>
+                <w:sz w:val="22"/>
+              </w:rPr>
+              <w:t>19</w:t>
+            </w:r>
+          </w:p>
+        </w:tc>
+        <w:tc>
+          <w:tcPr>
+            <w:tcW w:type="dxa" w:w="2948"/>
             <w:shd w:fill="F4F6F9" w:val="clear"/>
           </w:tcPr>
           <w:p>
@@ -1135,7 +1496,7 @@
         </w:tc>
         <w:tc>
           <w:tcPr>
-            <w:tcW w:type="dxa" w:w="3515"/>
+            <w:tcW w:type="dxa" w:w="3288"/>
             <w:shd w:fill="F4F6F9" w:val="clear"/>
           </w:tcPr>
           <w:p>
@@ -1153,7 +1514,7 @@
         </w:tc>
         <w:tc>
           <w:tcPr>
-            <w:tcW w:type="dxa" w:w="3742"/>
+            <w:tcW w:type="dxa" w:w="3402"/>
             <w:shd w:fill="F4F6F9" w:val="clear"/>
           </w:tcPr>
           <w:p>
@@ -1173,7 +1534,25 @@
       <w:tr>
         <w:tc>
           <w:tcPr>
-            <w:tcW w:type="dxa" w:w="3061"/>
+            <w:tcW w:type="dxa" w:w="680"/>
+            <w:shd w:fill="FFFFFF" w:val="clear"/>
+          </w:tcPr>
+          <w:p>
+            <w:r/>
+            <w:r>
+              <w:rPr>
+                <w:rFonts w:ascii="Calibri" w:hAnsi="Calibri" w:eastAsia="Calibri"/>
+                <w:b/>
+                <w:color w:val="1A2332"/>
+                <w:sz w:val="22"/>
+              </w:rPr>
+              <w:t>20</w:t>
+            </w:r>
+          </w:p>
+        </w:tc>
+        <w:tc>
+          <w:tcPr>
+            <w:tcW w:type="dxa" w:w="2948"/>
             <w:shd w:fill="FFFFFF" w:val="clear"/>
           </w:tcPr>
           <w:p>
@@ -1191,7 +1570,7 @@
         </w:tc>
         <w:tc>
           <w:tcPr>
-            <w:tcW w:type="dxa" w:w="3515"/>
+            <w:tcW w:type="dxa" w:w="3288"/>
             <w:shd w:fill="FFFFFF" w:val="clear"/>
           </w:tcPr>
           <w:p>
@@ -1209,7 +1588,7 @@
         </w:tc>
         <w:tc>
           <w:tcPr>
-            <w:tcW w:type="dxa" w:w="3742"/>
+            <w:tcW w:type="dxa" w:w="3402"/>
             <w:shd w:fill="FFFFFF" w:val="clear"/>
           </w:tcPr>
           <w:p>
@@ -1229,7 +1608,25 @@
       <w:tr>
         <w:tc>
           <w:tcPr>
-            <w:tcW w:type="dxa" w:w="3061"/>
+            <w:tcW w:type="dxa" w:w="680"/>
+            <w:shd w:fill="F4F6F9" w:val="clear"/>
+          </w:tcPr>
+          <w:p>
+            <w:r/>
+            <w:r>
+              <w:rPr>
+                <w:rFonts w:ascii="Calibri" w:hAnsi="Calibri" w:eastAsia="Calibri"/>
+                <w:b/>
+                <w:color w:val="1A2332"/>
+                <w:sz w:val="22"/>
+              </w:rPr>
+              <w:t>21</w:t>
+            </w:r>
+          </w:p>
+        </w:tc>
+        <w:tc>
+          <w:tcPr>
+            <w:tcW w:type="dxa" w:w="2948"/>
             <w:shd w:fill="F4F6F9" w:val="clear"/>
           </w:tcPr>
           <w:p>
@@ -1247,7 +1644,7 @@
         </w:tc>
         <w:tc>
           <w:tcPr>
-            <w:tcW w:type="dxa" w:w="3515"/>
+            <w:tcW w:type="dxa" w:w="3288"/>
             <w:shd w:fill="F4F6F9" w:val="clear"/>
           </w:tcPr>
           <w:p>
@@ -1265,7 +1662,7 @@
         </w:tc>
         <w:tc>
           <w:tcPr>
-            <w:tcW w:type="dxa" w:w="3742"/>
+            <w:tcW w:type="dxa" w:w="3402"/>
             <w:shd w:fill="F4F6F9" w:val="clear"/>
           </w:tcPr>
           <w:p>
@@ -1285,7 +1682,25 @@
       <w:tr>
         <w:tc>
           <w:tcPr>
-            <w:tcW w:type="dxa" w:w="3061"/>
+            <w:tcW w:type="dxa" w:w="680"/>
+            <w:shd w:fill="FFFFFF" w:val="clear"/>
+          </w:tcPr>
+          <w:p>
+            <w:r/>
+            <w:r>
+              <w:rPr>
+                <w:rFonts w:ascii="Calibri" w:hAnsi="Calibri" w:eastAsia="Calibri"/>
+                <w:b/>
+                <w:color w:val="1A2332"/>
+                <w:sz w:val="22"/>
+              </w:rPr>
+              <w:t>22</w:t>
+            </w:r>
+          </w:p>
+        </w:tc>
+        <w:tc>
+          <w:tcPr>
+            <w:tcW w:type="dxa" w:w="2948"/>
             <w:shd w:fill="FFFFFF" w:val="clear"/>
           </w:tcPr>
           <w:p>
@@ -1303,7 +1718,7 @@
         </w:tc>
         <w:tc>
           <w:tcPr>
-            <w:tcW w:type="dxa" w:w="3515"/>
+            <w:tcW w:type="dxa" w:w="3288"/>
             <w:shd w:fill="FFFFFF" w:val="clear"/>
           </w:tcPr>
           <w:p>
@@ -1321,7 +1736,7 @@
         </w:tc>
         <w:tc>
           <w:tcPr>
-            <w:tcW w:type="dxa" w:w="3742"/>
+            <w:tcW w:type="dxa" w:w="3402"/>
             <w:shd w:fill="FFFFFF" w:val="clear"/>
           </w:tcPr>
           <w:p>
@@ -1341,7 +1756,25 @@
       <w:tr>
         <w:tc>
           <w:tcPr>
-            <w:tcW w:type="dxa" w:w="3061"/>
+            <w:tcW w:type="dxa" w:w="680"/>
+            <w:shd w:fill="F4F6F9" w:val="clear"/>
+          </w:tcPr>
+          <w:p>
+            <w:r/>
+            <w:r>
+              <w:rPr>
+                <w:rFonts w:ascii="Calibri" w:hAnsi="Calibri" w:eastAsia="Calibri"/>
+                <w:b/>
+                <w:color w:val="1A2332"/>
+                <w:sz w:val="22"/>
+              </w:rPr>
+              <w:t>23</w:t>
+            </w:r>
+          </w:p>
+        </w:tc>
+        <w:tc>
+          <w:tcPr>
+            <w:tcW w:type="dxa" w:w="2948"/>
             <w:shd w:fill="F4F6F9" w:val="clear"/>
           </w:tcPr>
           <w:p>
@@ -1359,7 +1792,7 @@
         </w:tc>
         <w:tc>
           <w:tcPr>
-            <w:tcW w:type="dxa" w:w="3515"/>
+            <w:tcW w:type="dxa" w:w="3288"/>
             <w:shd w:fill="F4F6F9" w:val="clear"/>
           </w:tcPr>
           <w:p>
@@ -1377,7 +1810,7 @@
         </w:tc>
         <w:tc>
           <w:tcPr>
-            <w:tcW w:type="dxa" w:w="3742"/>
+            <w:tcW w:type="dxa" w:w="3402"/>
             <w:shd w:fill="F4F6F9" w:val="clear"/>
           </w:tcPr>
           <w:p>

</xml_diff>